<commit_message>
acta de cierre completa
</commit_message>
<xml_diff>
--- a/api/src/controllers/fillContracts/1-2- A3 acta de cierre CENTRO JUDICIAL VIRTUAL VIGENTE-8.docx
+++ b/api/src/controllers/fillContracts/1-2- A3 acta de cierre CENTRO JUDICIAL VIRTUAL VIGENTE-8.docx
@@ -1,6 +1,6 @@
 
 <file path=word/document.xml><?xml version="1.0" encoding="utf-8"?>
-<w:document xmlns:wpc="http://schemas.microsoft.com/office/word/2010/wordprocessingCanvas" xmlns:cx="http://schemas.microsoft.com/office/drawing/2014/chartex" xmlns:cx1="http://schemas.microsoft.com/office/drawing/2015/9/8/chartex" xmlns:cx2="http://schemas.microsoft.com/office/drawing/2015/10/21/chartex" xmlns:cx3="http://schemas.microsoft.com/office/drawing/2016/5/9/chartex" xmlns:cx4="http://schemas.microsoft.com/office/drawing/2016/5/10/chartex" xmlns:cx5="http://schemas.microsoft.com/office/drawing/2016/5/11/chartex" xmlns:cx6="http://schemas.microsoft.com/office/drawing/2016/5/12/chartex" xmlns:cx7="http://schemas.microsoft.com/office/drawing/2016/5/13/chartex" xmlns:cx8="http://schemas.microsoft.com/office/drawing/2016/5/14/chartex" xmlns:mc="http://schemas.openxmlformats.org/markup-compatibility/2006" xmlns:aink="http://schemas.microsoft.com/office/drawing/2016/ink" xmlns:am3d="http://schemas.microsoft.com/office/drawing/2017/model3d" xmlns:o="urn:schemas-microsoft-com:office:office" xmlns:oel="http://schemas.microsoft.com/office/2019/extlst" xmlns:r="http://schemas.openxmlformats.org/officeDocument/2006/relationships" xmlns:m="http://schemas.openxmlformats.org/officeDocument/2006/math" xmlns:v="urn:schemas-microsoft-com:vml" xmlns:wp14="http://schemas.microsoft.com/office/word/2010/wordprocessingDrawing" xmlns:wp="http://schemas.openxmlformats.org/drawingml/2006/wordprocessingDrawing" xmlns:w10="urn:schemas-microsoft-com:office:word" xmlns:w="http://schemas.openxmlformats.org/wordprocessingml/2006/main" xmlns:w14="http://schemas.microsoft.com/office/word/2010/wordml" xmlns:w15="http://schemas.microsoft.com/office/word/2012/wordml" xmlns:w16cei="http://schemas.microsoft.com/office/word/2026/wordml/cei" xmlns:w16cex="http://schemas.microsoft.com/office/word/2018/wordml/cex" xmlns:w16cid="http://schemas.microsoft.com/office/word/2016/wordml/cid" xmlns:w16="http://schemas.microsoft.com/office/word/2018/wordml" xmlns:w16du="http://schemas.microsoft.com/office/word/2023/wordml/word16du" xmlns:w16sdtdh="http://schemas.microsoft.com/office/word/2020/wordml/sdtdatahash" xmlns:w16sdtfl="http://schemas.microsoft.com/office/word/2024/wordml/sdtformatlock" xmlns:w16se="http://schemas.microsoft.com/office/word/2015/wordml/symex" xmlns:wpg="http://schemas.microsoft.com/office/word/2010/wordprocessingGroup" xmlns:wpi="http://schemas.microsoft.com/office/word/2010/wordprocessingInk" xmlns:wne="http://schemas.microsoft.com/office/word/2006/wordml" xmlns:wps="http://schemas.microsoft.com/office/word/2010/wordprocessingShape" mc:Ignorable="w14 w15 w16se w16cid w16 w16cex w16sdtdh w16sdtfl w16du wp14">
+<w:document xmlns:wpc="http://schemas.microsoft.com/office/word/2010/wordprocessingCanvas" xmlns:cx="http://schemas.microsoft.com/office/drawing/2014/chartex" xmlns:cx1="http://schemas.microsoft.com/office/drawing/2015/9/8/chartex" xmlns:mc="http://schemas.openxmlformats.org/markup-compatibility/2006" xmlns:o="urn:schemas-microsoft-com:office:office" xmlns:r="http://schemas.openxmlformats.org/officeDocument/2006/relationships" xmlns:m="http://schemas.openxmlformats.org/officeDocument/2006/math" xmlns:v="urn:schemas-microsoft-com:vml" xmlns:wp14="http://schemas.microsoft.com/office/word/2010/wordprocessingDrawing" xmlns:wp="http://schemas.openxmlformats.org/drawingml/2006/wordprocessingDrawing" xmlns:w10="urn:schemas-microsoft-com:office:word" xmlns:w="http://schemas.openxmlformats.org/wordprocessingml/2006/main" xmlns:w14="http://schemas.microsoft.com/office/word/2010/wordml" xmlns:w15="http://schemas.microsoft.com/office/word/2012/wordml" xmlns:w16se="http://schemas.microsoft.com/office/word/2015/wordml/symex" xmlns:wpg="http://schemas.microsoft.com/office/word/2010/wordprocessingGroup" xmlns:wpi="http://schemas.microsoft.com/office/word/2010/wordprocessingInk" xmlns:wne="http://schemas.microsoft.com/office/word/2006/wordml" xmlns:wps="http://schemas.microsoft.com/office/word/2010/wordprocessingShape" mc:Ignorable="w14 w15 w16se wp14">
   <w:background w:color="FFFFFF"/>
   <w:body>
     <w:tbl>
@@ -147,6 +147,16 @@
         </w:rPr>
         <w:t>Centro de Mediación: {adressMediacion}</w:t>
       </w:r>
+      <w:r>
+        <w:rPr>
+          <w:rFonts w:ascii="Times New Roman" w:eastAsia="Roboto" w:hAnsi="Times New Roman" w:cs="Times New Roman"/>
+        </w:rPr>
+      </w:r>
+      <w:r>
+        <w:rPr>
+          <w:rFonts w:ascii="Times New Roman" w:eastAsia="Roboto" w:hAnsi="Times New Roman" w:cs="Times New Roman"/>
+        </w:rPr>
+      </w:r>
     </w:p>
     <w:p>
       <w:pPr>
@@ -406,7 +416,12 @@
         <w:rPr>
           <w:rFonts w:ascii="Times New Roman" w:eastAsia="Roboto" w:hAnsi="Times New Roman" w:cs="Times New Roman"/>
         </w:rPr>
-        <w:t>Localidad: ______________________________  CP: ______</w:t>
+        <w:t>Localidad: {requirente_localidad}  CP: {requirente_cp}</w:t>
+      </w:r>
+      <w:r>
+        <w:rPr>
+          <w:rFonts w:ascii="Times New Roman" w:eastAsia="Roboto" w:hAnsi="Times New Roman" w:cs="Times New Roman"/>
+        </w:rPr>
       </w:r>
     </w:p>
     <w:p>
@@ -421,21 +436,19 @@
         <w:rPr>
           <w:rFonts w:ascii="Times New Roman" w:eastAsia="Roboto" w:hAnsi="Times New Roman" w:cs="Times New Roman"/>
         </w:rPr>
-        <w:t xml:space="preserve">Teléfono fijo: </w:t>
+        <w:t>Teléfono fijo: {requirente_phoneFixed}  Teléfono móvil: {requirente_phoneNumber}</w:t>
       </w:r>
       <w:r>
         <w:rPr>
           <w:rFonts w:ascii="Times New Roman" w:eastAsia="Roboto" w:hAnsi="Times New Roman" w:cs="Times New Roman"/>
           <w:i/>
         </w:rPr>
-        <w:t>_</w:t>
       </w:r>
       <w:r>
         <w:rPr>
           <w:rFonts w:ascii="Times New Roman" w:eastAsia="Roboto" w:hAnsi="Times New Roman" w:cs="Times New Roman"/>
           <w:i/>
         </w:rPr>
-        <w:t>__________</w:t>
       </w:r>
       <w:proofErr w:type="gramStart"/>
       <w:r>
@@ -443,26 +456,22 @@
           <w:rFonts w:ascii="Times New Roman" w:eastAsia="Roboto" w:hAnsi="Times New Roman" w:cs="Times New Roman"/>
           <w:i/>
         </w:rPr>
-        <w:t xml:space="preserve">_  </w:t>
-      </w:r>
-      <w:r>
-        <w:rPr>
-          <w:rFonts w:ascii="Times New Roman" w:eastAsia="Roboto" w:hAnsi="Times New Roman" w:cs="Times New Roman"/>
-        </w:rPr>
-        <w:t>Teléfono</w:t>
+      </w:r>
+      <w:r>
+        <w:rPr>
+          <w:rFonts w:ascii="Times New Roman" w:eastAsia="Roboto" w:hAnsi="Times New Roman" w:cs="Times New Roman"/>
+        </w:rPr>
       </w:r>
       <w:proofErr w:type="gramEnd"/>
       <w:r>
         <w:rPr>
           <w:rFonts w:ascii="Times New Roman" w:eastAsia="Roboto" w:hAnsi="Times New Roman" w:cs="Times New Roman"/>
         </w:rPr>
-        <w:t xml:space="preserve"> móvil:</w:t>
-      </w:r>
-      <w:r>
-        <w:rPr>
-          <w:rFonts w:ascii="Times New Roman" w:eastAsia="Roboto" w:hAnsi="Times New Roman" w:cs="Times New Roman"/>
-        </w:rPr>
-        <w:t xml:space="preserve"> {requirente_phoneNumber}</w:t>
+      </w:r>
+      <w:r>
+        <w:rPr>
+          <w:rFonts w:ascii="Times New Roman" w:eastAsia="Roboto" w:hAnsi="Times New Roman" w:cs="Times New Roman"/>
+        </w:rPr>
       </w:r>
     </w:p>
     <w:p>
@@ -500,21 +509,24 @@
         <w:rPr>
           <w:rFonts w:ascii="Times New Roman" w:eastAsia="Roboto" w:hAnsi="Times New Roman" w:cs="Times New Roman"/>
         </w:rPr>
-        <w:t>Localidad: _____________________________</w:t>
+        <w:t>Localidad: {requirente_letrado_localidad}  CP: {requirente_letrado_cp}</w:t>
       </w:r>
       <w:proofErr w:type="gramStart"/>
       <w:r>
         <w:rPr>
           <w:rFonts w:ascii="Times New Roman" w:eastAsia="Roboto" w:hAnsi="Times New Roman" w:cs="Times New Roman"/>
         </w:rPr>
-        <w:t>_  CP</w:t>
       </w:r>
       <w:proofErr w:type="gramEnd"/>
       <w:r>
         <w:rPr>
           <w:rFonts w:ascii="Times New Roman" w:eastAsia="Roboto" w:hAnsi="Times New Roman" w:cs="Times New Roman"/>
         </w:rPr>
-        <w:t>: ______</w:t>
+      </w:r>
+      <w:r>
+        <w:rPr>
+          <w:rFonts w:ascii="Times New Roman" w:eastAsia="Roboto" w:hAnsi="Times New Roman" w:cs="Times New Roman"/>
+        </w:rPr>
       </w:r>
     </w:p>
     <w:p>
@@ -585,27 +597,71 @@
           <w:rFonts w:ascii="Times New Roman" w:eastAsia="Roboto" w:hAnsi="Times New Roman" w:cs="Times New Roman"/>
         </w:rPr>
         <w:t>Abogado/a Patrocinante: {requirente_letrado_name}</w:t>
-      </w:r>
-      <w:r>
-        <w:rPr>
-          <w:rFonts w:ascii="Times New Roman" w:eastAsia="Roboto" w:hAnsi="Times New Roman" w:cs="Times New Roman"/>
-        </w:rPr>
         <w:br/>
-        <w:t xml:space="preserve">Mat. </w:t>
+        <w:t>Mat. N°: {requirente_letrado_mat}</w:t>
       </w:r>
       <w:proofErr w:type="spellStart"/>
       <w:r>
         <w:rPr>
           <w:rFonts w:ascii="Times New Roman" w:eastAsia="Roboto" w:hAnsi="Times New Roman" w:cs="Times New Roman"/>
         </w:rPr>
-        <w:t>N°</w:t>
       </w:r>
       <w:proofErr w:type="spellEnd"/>
       <w:r>
         <w:rPr>
           <w:rFonts w:ascii="Times New Roman" w:eastAsia="Roboto" w:hAnsi="Times New Roman" w:cs="Times New Roman"/>
         </w:rPr>
-        <w:t>: __________</w:t>
+      </w:r>
+      <w:proofErr w:type="spellStart"/>
+      <w:r>
+        <w:rPr>
+          <w:rFonts w:ascii="Times New Roman" w:eastAsia="Roboto" w:hAnsi="Times New Roman" w:cs="Times New Roman"/>
+        </w:rPr>
+      </w:r>
+      <w:proofErr w:type="spellEnd"/>
+      <w:r>
+        <w:rPr>
+          <w:rFonts w:ascii="Times New Roman" w:eastAsia="Roboto" w:hAnsi="Times New Roman" w:cs="Times New Roman"/>
+        </w:rPr>
+      </w:r>
+      <w:r>
+        <w:rPr>
+          <w:rFonts w:ascii="Times New Roman" w:eastAsia="Roboto" w:hAnsi="Times New Roman" w:cs="Times New Roman"/>
+        </w:rPr>
+      </w:r>
+      <w:r>
+        <w:rPr>
+          <w:rFonts w:ascii="Times New Roman" w:eastAsia="Roboto" w:hAnsi="Times New Roman" w:cs="Times New Roman"/>
+        </w:rPr>
+      </w:r>
+      <w:r>
+        <w:rPr>
+          <w:rFonts w:ascii="Times New Roman" w:eastAsia="Roboto" w:hAnsi="Times New Roman" w:cs="Times New Roman"/>
+        </w:rPr>
+      </w:r>
+      <w:r>
+        <w:rPr>
+          <w:rFonts w:ascii="Times New Roman" w:eastAsia="Roboto" w:hAnsi="Times New Roman" w:cs="Times New Roman"/>
+        </w:rPr>
+      </w:r>
+      <w:r>
+        <w:rPr>
+          <w:rFonts w:ascii="Times New Roman" w:eastAsia="Roboto" w:hAnsi="Times New Roman" w:cs="Times New Roman"/>
+        </w:rPr>
+      </w:r>
+      <w:r>
+        <w:rPr>
+          <w:rFonts w:ascii="Times New Roman" w:eastAsia="Roboto" w:hAnsi="Times New Roman" w:cs="Times New Roman"/>
+        </w:rPr>
+      </w:r>
+      <w:r>
+        <w:rPr>
+          <w:rFonts w:ascii="Calibri" w:hAnsi="Calibri" w:cs="Calibri"/>
+          <w:b/>
+          <w:bCs/>
+          <w:color w:val="212529"/>
+          <w:shd w:val="clear" w:color="auto" w:fill="FFFFFF"/>
+        </w:rPr>
       </w:r>
     </w:p>
     <w:p>
@@ -767,7 +823,27 @@
         <w:rPr>
           <w:rFonts w:ascii="Times New Roman" w:eastAsia="Roboto" w:hAnsi="Times New Roman" w:cs="Times New Roman"/>
         </w:rPr>
-        <w:t>Localidad: ______________________________  CP: ______</w:t>
+        <w:t>Localidad: {requerido_localidad}  CP: {requerido_cp}</w:t>
+      </w:r>
+      <w:r>
+        <w:rPr>
+          <w:rFonts w:ascii="Times New Roman" w:eastAsia="Roboto" w:hAnsi="Times New Roman" w:cs="Times New Roman"/>
+        </w:rPr>
+      </w:r>
+      <w:r>
+        <w:rPr>
+          <w:rFonts w:ascii="Times New Roman" w:eastAsia="Roboto" w:hAnsi="Times New Roman" w:cs="Times New Roman"/>
+        </w:rPr>
+      </w:r>
+      <w:r>
+        <w:rPr>
+          <w:rFonts w:ascii="Times New Roman" w:eastAsia="Roboto" w:hAnsi="Times New Roman" w:cs="Times New Roman"/>
+        </w:rPr>
+      </w:r>
+      <w:r>
+        <w:rPr>
+          <w:rFonts w:ascii="Times New Roman" w:eastAsia="Roboto" w:hAnsi="Times New Roman" w:cs="Times New Roman"/>
+        </w:rPr>
       </w:r>
     </w:p>
     <w:p>
@@ -782,14 +858,13 @@
         <w:rPr>
           <w:rFonts w:ascii="Times New Roman" w:eastAsia="Roboto" w:hAnsi="Times New Roman" w:cs="Times New Roman"/>
         </w:rPr>
-        <w:t xml:space="preserve">Teléfono fijo: </w:t>
+        <w:t>Teléfono fijo: {requerido_phoneFixed}  Teléfono móvil: {requerido_phoneNumber}</w:t>
       </w:r>
       <w:r>
         <w:rPr>
           <w:rFonts w:ascii="Times New Roman" w:eastAsia="Roboto" w:hAnsi="Times New Roman" w:cs="Times New Roman"/>
           <w:i/>
         </w:rPr>
-        <w:t>_____________</w:t>
       </w:r>
       <w:proofErr w:type="gramStart"/>
       <w:r>
@@ -797,46 +872,27 @@
           <w:rFonts w:ascii="Times New Roman" w:eastAsia="Roboto" w:hAnsi="Times New Roman" w:cs="Times New Roman"/>
           <w:i/>
         </w:rPr>
-        <w:t xml:space="preserve">_  </w:t>
-      </w:r>
-      <w:r>
-        <w:rPr>
-          <w:rFonts w:ascii="Times New Roman" w:eastAsia="Roboto" w:hAnsi="Times New Roman" w:cs="Times New Roman"/>
-        </w:rPr>
-        <w:t>Teléfono</w:t>
+      </w:r>
+      <w:r>
+        <w:rPr>
+          <w:rFonts w:ascii="Times New Roman" w:eastAsia="Roboto" w:hAnsi="Times New Roman" w:cs="Times New Roman"/>
+        </w:rPr>
       </w:r>
       <w:proofErr w:type="gramEnd"/>
       <w:r>
         <w:rPr>
           <w:rFonts w:ascii="Times New Roman" w:eastAsia="Roboto" w:hAnsi="Times New Roman" w:cs="Times New Roman"/>
         </w:rPr>
-        <w:t xml:space="preserve"> móvil:</w:t>
-      </w:r>
-      <w:proofErr w:type="gramStart"/>
-      <w:r>
-        <w:rPr>
-          <w:rFonts w:ascii="Times New Roman" w:eastAsia="Roboto" w:hAnsi="Times New Roman" w:cs="Times New Roman"/>
-        </w:rPr>
-        <w:t xml:space="preserve"> </w:t>
-      </w:r>
-      <w:r>
-        <w:rPr>
-          <w:rFonts w:ascii="Times New Roman" w:eastAsia="Roboto" w:hAnsi="Times New Roman" w:cs="Times New Roman"/>
-        </w:rPr>
-        <w:t xml:space="preserve">  </w:t>
-      </w:r>
-      <w:r>
-        <w:rPr>
-          <w:rFonts w:ascii="Times New Roman" w:eastAsia="Roboto" w:hAnsi="Times New Roman" w:cs="Times New Roman"/>
-        </w:rPr>
-        <w:t>{</w:t>
-      </w:r>
-      <w:proofErr w:type="gramEnd"/>
-      <w:r>
-        <w:rPr>
-          <w:rFonts w:ascii="Times New Roman" w:eastAsia="Roboto" w:hAnsi="Times New Roman" w:cs="Times New Roman"/>
-        </w:rPr>
-        <w:t>requerido_phoneNumber}</w:t>
+      </w:r>
+      <w:r>
+        <w:rPr>
+          <w:rFonts w:ascii="Times New Roman" w:eastAsia="Roboto" w:hAnsi="Times New Roman" w:cs="Times New Roman"/>
+        </w:rPr>
+      </w:r>
+      <w:r>
+        <w:rPr>
+          <w:rFonts w:ascii="Times New Roman" w:eastAsia="Roboto" w:hAnsi="Times New Roman" w:cs="Times New Roman"/>
+        </w:rPr>
       </w:r>
     </w:p>
     <w:p>
@@ -854,27 +910,63 @@
           <w:rFonts w:ascii="Times New Roman" w:eastAsia="Roboto" w:hAnsi="Times New Roman" w:cs="Times New Roman"/>
         </w:rPr>
         <w:t>Abogado/a Patrocinante: {requerido_letrado_name}</w:t>
-      </w:r>
-      <w:r>
-        <w:rPr>
-          <w:rFonts w:ascii="Times New Roman" w:eastAsia="Roboto" w:hAnsi="Times New Roman" w:cs="Times New Roman"/>
-        </w:rPr>
         <w:br/>
-        <w:t xml:space="preserve">Mat. </w:t>
+        <w:t>Mat. N°: {requerido_letrado_mat}</w:t>
+      </w:r>
+      <w:r>
+        <w:rPr>
+          <w:rFonts w:ascii="Times New Roman" w:eastAsia="Roboto" w:hAnsi="Times New Roman" w:cs="Times New Roman"/>
+        </w:rPr>
       </w:r>
       <w:proofErr w:type="spellStart"/>
       <w:r>
         <w:rPr>
           <w:rFonts w:ascii="Times New Roman" w:eastAsia="Roboto" w:hAnsi="Times New Roman" w:cs="Times New Roman"/>
         </w:rPr>
-        <w:t>N°</w:t>
       </w:r>
       <w:proofErr w:type="spellEnd"/>
       <w:r>
         <w:rPr>
           <w:rFonts w:ascii="Times New Roman" w:eastAsia="Roboto" w:hAnsi="Times New Roman" w:cs="Times New Roman"/>
-        </w:rPr>
-        <w:t>: __________</w:t>
+          <w:i/>
+        </w:rPr>
+      </w:r>
+      <w:r>
+        <w:rPr>
+          <w:rFonts w:ascii="Times New Roman" w:eastAsia="Roboto" w:hAnsi="Times New Roman" w:cs="Times New Roman"/>
+        </w:rPr>
+      </w:r>
+      <w:r>
+        <w:rPr>
+          <w:rFonts w:ascii="Times New Roman" w:eastAsia="Roboto" w:hAnsi="Times New Roman" w:cs="Times New Roman"/>
+        </w:rPr>
+      </w:r>
+      <w:r>
+        <w:rPr>
+          <w:rFonts w:ascii="Times New Roman" w:eastAsia="Roboto" w:hAnsi="Times New Roman" w:cs="Times New Roman"/>
+        </w:rPr>
+      </w:r>
+      <w:r>
+        <w:rPr>
+          <w:rFonts w:ascii="Times New Roman" w:eastAsia="Roboto" w:hAnsi="Times New Roman" w:cs="Times New Roman"/>
+        </w:rPr>
+      </w:r>
+      <w:r>
+        <w:rPr>
+          <w:rFonts w:ascii="Times New Roman" w:eastAsia="Roboto" w:hAnsi="Times New Roman" w:cs="Times New Roman"/>
+        </w:rPr>
+      </w:r>
+      <w:proofErr w:type="gramStart"/>
+      <w:r>
+        <w:rPr>
+          <w:rFonts w:ascii="Times New Roman" w:eastAsia="Roboto" w:hAnsi="Times New Roman" w:cs="Times New Roman"/>
+        </w:rPr>
+      </w:r>
+      <w:proofErr w:type="gramEnd"/>
+      <w:r>
+        <w:rPr>
+          <w:rFonts w:ascii="Times New Roman" w:eastAsia="Roboto" w:hAnsi="Times New Roman" w:cs="Times New Roman"/>
+        </w:rPr>
       </w:r>
     </w:p>
     <w:p>
@@ -924,6 +1016,23 @@
         </w:rPr>
         <w:t>Nombre y Apellido:    {requirente_mediador_name}                  MAT.N° {requirente_mediador_mat}</w:t>
       </w:r>
+      <w:r>
+        <w:rPr>
+          <w:rFonts w:ascii="Times New Roman" w:eastAsia="Roboto" w:hAnsi="Times New Roman" w:cs="Times New Roman"/>
+        </w:rPr>
+      </w:r>
+      <w:proofErr w:type="spellStart"/>
+      <w:r>
+        <w:rPr>
+          <w:rFonts w:ascii="Times New Roman" w:eastAsia="Roboto" w:hAnsi="Times New Roman" w:cs="Times New Roman"/>
+        </w:rPr>
+      </w:r>
+      <w:proofErr w:type="spellEnd"/>
+      <w:r>
+        <w:rPr>
+          <w:rFonts w:ascii="Times New Roman" w:eastAsia="Roboto" w:hAnsi="Times New Roman" w:cs="Times New Roman"/>
+        </w:rPr>
+      </w:r>
     </w:p>
     <w:p>
       <w:pPr>
@@ -940,6 +1049,23 @@
           <w:rFonts w:ascii="Times New Roman" w:eastAsia="Roboto" w:hAnsi="Times New Roman" w:cs="Times New Roman"/>
         </w:rPr>
         <w:t>Nombre y Apellido:    {requerido_mediador_name}                  MAT.N° {requerido_mediador_mat}</w:t>
+      </w:r>
+      <w:r>
+        <w:rPr>
+          <w:rFonts w:ascii="Times New Roman" w:eastAsia="Roboto" w:hAnsi="Times New Roman" w:cs="Times New Roman"/>
+        </w:rPr>
+      </w:r>
+      <w:proofErr w:type="spellStart"/>
+      <w:r>
+        <w:rPr>
+          <w:rFonts w:ascii="Times New Roman" w:eastAsia="Roboto" w:hAnsi="Times New Roman" w:cs="Times New Roman"/>
+        </w:rPr>
+      </w:r>
+      <w:proofErr w:type="spellEnd"/>
+      <w:r>
+        <w:rPr>
+          <w:rFonts w:ascii="Times New Roman" w:eastAsia="Roboto" w:hAnsi="Times New Roman" w:cs="Times New Roman"/>
+        </w:rPr>
       </w:r>
     </w:p>
     <w:p>
@@ -981,6 +1107,21 @@
         </w:rPr>
         <w:t>Nombre y Apellido / Razón Social: {tercero_name}</w:t>
       </w:r>
+      <w:r>
+        <w:rPr>
+          <w:rFonts w:ascii="Times New Roman" w:eastAsia="Roboto" w:hAnsi="Times New Roman" w:cs="Times New Roman"/>
+        </w:rPr>
+      </w:r>
+      <w:r>
+        <w:rPr>
+          <w:rFonts w:ascii="Times New Roman" w:eastAsia="Roboto" w:hAnsi="Times New Roman" w:cs="Times New Roman"/>
+        </w:rPr>
+      </w:r>
+      <w:r>
+        <w:rPr>
+          <w:rFonts w:ascii="Times New Roman" w:eastAsia="Roboto" w:hAnsi="Times New Roman" w:cs="Times New Roman"/>
+        </w:rPr>
+      </w:r>
     </w:p>
     <w:p>
       <w:pPr>
@@ -998,6 +1139,18 @@
         </w:rPr>
         <w:t>Tipo y N° de Documento / CUIT: {tercero_dni}</w:t>
       </w:r>
+      <w:r>
+        <w:rPr>
+          <w:rFonts w:ascii="Times New Roman" w:eastAsia="Roboto" w:hAnsi="Times New Roman" w:cs="Times New Roman"/>
+          <w:i/>
+        </w:rPr>
+      </w:r>
+      <w:r>
+        <w:rPr>
+          <w:rFonts w:ascii="Times New Roman" w:eastAsia="Roboto" w:hAnsi="Times New Roman" w:cs="Times New Roman"/>
+          <w:i/>
+        </w:rPr>
+      </w:r>
     </w:p>
     <w:p>
       <w:pPr>
@@ -1015,6 +1168,12 @@
         </w:rPr>
         <w:t>Domicilio real: {tercero_adress}</w:t>
       </w:r>
+      <w:r>
+        <w:rPr>
+          <w:rFonts w:ascii="Times New Roman" w:eastAsia="Roboto" w:hAnsi="Times New Roman" w:cs="Times New Roman"/>
+          <w:i/>
+        </w:rPr>
+      </w:r>
     </w:p>
     <w:p>
       <w:pPr>
@@ -1030,7 +1189,7 @@
         <w:rPr>
           <w:rFonts w:ascii="Times New Roman" w:eastAsia="Roboto" w:hAnsi="Times New Roman" w:cs="Times New Roman"/>
         </w:rPr>
-        <w:t>Localidad: ______________________________________________ CP: {tercero_cp}</w:t>
+        <w:t>Localidad: {tercero_localidad} CP: {tercero_cp}</w:t>
       </w:r>
     </w:p>
     <w:p>
@@ -1046,6 +1205,29 @@
           <w:rFonts w:ascii="Times New Roman" w:eastAsia="Roboto" w:hAnsi="Times New Roman" w:cs="Times New Roman"/>
         </w:rPr>
         <w:t>Teléfono fijo: {tercero_phoneNumber}             Teléfono móvil: {tercero_cellPhone}</w:t>
+      </w:r>
+      <w:r>
+        <w:rPr>
+          <w:rFonts w:ascii="Times New Roman" w:eastAsia="Roboto" w:hAnsi="Times New Roman" w:cs="Times New Roman"/>
+          <w:i/>
+        </w:rPr>
+      </w:r>
+      <w:r>
+        <w:rPr>
+          <w:rFonts w:ascii="Times New Roman" w:eastAsia="Roboto" w:hAnsi="Times New Roman" w:cs="Times New Roman"/>
+          <w:i/>
+        </w:rPr>
+      </w:r>
+      <w:r>
+        <w:rPr>
+          <w:rFonts w:ascii="Times New Roman" w:eastAsia="Roboto" w:hAnsi="Times New Roman" w:cs="Times New Roman"/>
+        </w:rPr>
+      </w:r>
+      <w:r>
+        <w:rPr>
+          <w:rFonts w:ascii="Times New Roman" w:eastAsia="Roboto" w:hAnsi="Times New Roman" w:cs="Times New Roman"/>
+          <w:i/>
+        </w:rPr>
       </w:r>
     </w:p>
     <w:p>
@@ -1064,6 +1246,12 @@
         </w:rPr>
         <w:t>Domicilio electrónico ___________________________________</w:t>
       </w:r>
+      <w:r>
+        <w:rPr>
+          <w:rFonts w:ascii="Times New Roman" w:eastAsia="Roboto" w:hAnsi="Times New Roman" w:cs="Times New Roman"/>
+          <w:i/>
+        </w:rPr>
+      </w:r>
     </w:p>
     <w:p>
       <w:pPr>
@@ -1079,49 +1267,42 @@
         <w:rPr>
           <w:rFonts w:ascii="Times New Roman" w:eastAsia="Roboto" w:hAnsi="Times New Roman" w:cs="Times New Roman"/>
         </w:rPr>
-        <w:t>Abogado/a Patrocinante: {</w:t>
+        <w:t>Abogado/a Patrocinante: {abogadoPatrocinante}                     Mat. N°: {abogadoPatrocinanteMat}</w:t>
+      </w:r>
+      <w:r>
+        <w:rPr>
+          <w:rFonts w:ascii="Times New Roman" w:eastAsia="Roboto" w:hAnsi="Times New Roman" w:cs="Times New Roman"/>
+        </w:rPr>
+      </w:r>
+      <w:proofErr w:type="spellStart"/>
+      <w:r>
+        <w:rPr>
+          <w:rFonts w:ascii="Times New Roman" w:eastAsia="Roboto" w:hAnsi="Times New Roman" w:cs="Times New Roman"/>
+        </w:rPr>
+      </w:r>
+      <w:proofErr w:type="spellEnd"/>
+      <w:r>
+        <w:rPr>
+          <w:rFonts w:ascii="Times New Roman" w:eastAsia="Roboto" w:hAnsi="Times New Roman" w:cs="Times New Roman"/>
+          <w:i/>
+        </w:rPr>
+      </w:r>
+      <w:r>
+        <w:rPr>
+          <w:rFonts w:ascii="Times New Roman" w:eastAsia="Roboto" w:hAnsi="Times New Roman" w:cs="Times New Roman"/>
+        </w:rPr>
       </w:r>
       <w:proofErr w:type="gramStart"/>
       <w:r>
         <w:rPr>
           <w:rFonts w:ascii="Times New Roman" w:eastAsia="Roboto" w:hAnsi="Times New Roman" w:cs="Times New Roman"/>
         </w:rPr>
-        <w:t xml:space="preserve">abogadoPatrocinante}   </w:t>
       </w:r>
       <w:proofErr w:type="gramEnd"/>
       <w:r>
         <w:rPr>
           <w:rFonts w:ascii="Times New Roman" w:eastAsia="Roboto" w:hAnsi="Times New Roman" w:cs="Times New Roman"/>
         </w:rPr>
-        <w:t xml:space="preserve">                  Mat. </w:t>
-      </w:r>
-      <w:proofErr w:type="spellStart"/>
-      <w:r>
-        <w:rPr>
-          <w:rFonts w:ascii="Times New Roman" w:eastAsia="Roboto" w:hAnsi="Times New Roman" w:cs="Times New Roman"/>
-        </w:rPr>
-        <w:t>N</w:t>
-      </w:r>
-      <w:proofErr w:type="gramStart"/>
-      <w:r>
-        <w:rPr>
-          <w:rFonts w:ascii="Times New Roman" w:eastAsia="Roboto" w:hAnsi="Times New Roman" w:cs="Times New Roman"/>
-        </w:rPr>
-        <w:t>°</w:t>
-      </w:r>
-      <w:proofErr w:type="spellEnd"/>
-      <w:r>
-        <w:rPr>
-          <w:rFonts w:ascii="Times New Roman" w:eastAsia="Roboto" w:hAnsi="Times New Roman" w:cs="Times New Roman"/>
-        </w:rPr>
-        <w:t>:_</w:t>
-      </w:r>
-      <w:proofErr w:type="gramEnd"/>
-      <w:r>
-        <w:rPr>
-          <w:rFonts w:ascii="Times New Roman" w:eastAsia="Roboto" w:hAnsi="Times New Roman" w:cs="Times New Roman"/>
-        </w:rPr>
-        <w:t>___________</w:t>
       </w:r>
     </w:p>
     <w:p>
@@ -1239,6 +1420,21 @@
         </w:rPr>
         <w:t>Fecha de la primera reunión:   {date} {start}hs</w:t>
       </w:r>
+      <w:r>
+        <w:rPr>
+          <w:rFonts w:ascii="Times New Roman" w:eastAsia="Roboto" w:hAnsi="Times New Roman" w:cs="Times New Roman"/>
+        </w:rPr>
+      </w:r>
+      <w:r>
+        <w:rPr>
+          <w:rFonts w:ascii="Times New Roman" w:eastAsia="Roboto" w:hAnsi="Times New Roman" w:cs="Times New Roman"/>
+        </w:rPr>
+      </w:r>
+      <w:r>
+        <w:rPr>
+          <w:rFonts w:ascii="Times New Roman" w:eastAsia="Roboto" w:hAnsi="Times New Roman" w:cs="Times New Roman"/>
+        </w:rPr>
+      </w:r>
     </w:p>
     <w:p>
       <w:pPr>
@@ -1256,6 +1452,21 @@
         </w:rPr>
         <w:t>Fecha de la última reunión:    {date} {end}hs</w:t>
       </w:r>
+      <w:r>
+        <w:rPr>
+          <w:rFonts w:ascii="Times New Roman" w:eastAsia="Roboto" w:hAnsi="Times New Roman" w:cs="Times New Roman"/>
+        </w:rPr>
+      </w:r>
+      <w:r>
+        <w:rPr>
+          <w:rFonts w:ascii="Times New Roman" w:eastAsia="Roboto" w:hAnsi="Times New Roman" w:cs="Times New Roman"/>
+        </w:rPr>
+      </w:r>
+      <w:r>
+        <w:rPr>
+          <w:rFonts w:ascii="Times New Roman" w:eastAsia="Roboto" w:hAnsi="Times New Roman" w:cs="Times New Roman"/>
+        </w:rPr>
+      </w:r>
     </w:p>
     <w:p>
       <w:pPr>
@@ -1293,7 +1504,7 @@
         <w:rPr>
           <w:rFonts w:ascii="Times New Roman" w:eastAsia="Roboto" w:hAnsi="Times New Roman" w:cs="Times New Roman"/>
         </w:rPr>
-        <w:t xml:space="preserve">CON ACUERDO:                                                       </w:t>
+        <w:t xml:space="preserve">CON ACUERDO:                                                         </w:t>
       </w:r>
       <w:bookmarkStart w:id="0" w:name="_Hlk189415894"/>
       <w:sdt>
@@ -1311,6 +1522,7 @@
             <w14:uncheckedState w14:val="2610" w14:font="MS Gothic"/>
           </w14:checkbox>
         </w:sdtPr>
+        <w:sdtEndPr/>
         <w:sdtContent>
           <w:r>
             <w:rPr>
@@ -1328,7 +1540,7 @@
         <w:rPr>
           <w:rFonts w:ascii="Times New Roman" w:eastAsia="Roboto" w:hAnsi="Times New Roman" w:cs="Times New Roman"/>
         </w:rPr>
-        <w:t xml:space="preserve">                        </w:t>
+        <w:t xml:space="preserve">                      </w:t>
       </w:r>
     </w:p>
     <w:p>
@@ -1370,6 +1582,7 @@
             <w14:uncheckedState w14:val="2610" w14:font="MS Gothic"/>
           </w14:checkbox>
         </w:sdtPr>
+        <w:sdtEndPr/>
         <w:sdtContent>
           <w:r>
             <w:rPr>
@@ -1440,6 +1653,7 @@
             <w14:uncheckedState w14:val="2610" w14:font="MS Gothic"/>
           </w14:checkbox>
         </w:sdtPr>
+        <w:sdtEndPr/>
         <w:sdtContent>
           <w:r>
             <w:rPr>
@@ -1494,6 +1708,7 @@
             <w14:uncheckedState w14:val="2610" w14:font="MS Gothic"/>
           </w14:checkbox>
         </w:sdtPr>
+        <w:sdtEndPr/>
         <w:sdtContent>
           <w:r>
             <w:rPr>
@@ -1546,6 +1761,7 @@
             <w14:uncheckedState w14:val="2610" w14:font="MS Gothic"/>
           </w14:checkbox>
         </w:sdtPr>
+        <w:sdtEndPr/>
         <w:sdtContent>
           <w:r>
             <w:rPr>
@@ -1597,6 +1813,7 @@
             <w14:uncheckedState w14:val="2610" w14:font="MS Gothic"/>
           </w14:checkbox>
         </w:sdtPr>
+        <w:sdtEndPr/>
         <w:sdtContent>
           <w:r>
             <w:rPr>
@@ -1691,6 +1908,7 @@
             <w14:uncheckedState w14:val="2610" w14:font="MS Gothic"/>
           </w14:checkbox>
         </w:sdtPr>
+        <w:sdtEndPr/>
         <w:sdtContent>
           <w:r>
             <w:rPr>
@@ -1749,6 +1967,7 @@
             <w14:uncheckedState w14:val="2610" w14:font="MS Gothic"/>
           </w14:checkbox>
         </w:sdtPr>
+        <w:sdtEndPr/>
         <w:sdtContent>
           <w:r>
             <w:rPr>
@@ -1789,11 +2008,12 @@
           </w:rPr>
           <w:id w:val="-1801369541"/>
           <w14:checkbox>
-            <w14:checked w14:val="0"/>
+            <w14:checked w14:val="1"/>
             <w14:checkedState w14:val="2612" w14:font="MS Gothic"/>
             <w14:uncheckedState w14:val="2610" w14:font="MS Gothic"/>
           </w14:checkbox>
         </w:sdtPr>
+        <w:sdtEndPr/>
         <w:sdtContent>
           <w:r>
             <w:rPr>
@@ -1801,7 +2021,7 @@
               <w:b/>
               <w:sz w:val="28"/>
             </w:rPr>
-            <w:t>☐</w:t>
+            <w:t>☒</w:t>
           </w:r>
         </w:sdtContent>
       </w:sdt>
@@ -1851,6 +2071,7 @@
             <w14:uncheckedState w14:val="2610" w14:font="MS Gothic"/>
           </w14:checkbox>
         </w:sdtPr>
+        <w:sdtEndPr/>
         <w:sdtContent>
           <w:r>
             <w:rPr>
@@ -1912,6 +2133,7 @@
             <w14:uncheckedState w14:val="2610" w14:font="MS Gothic"/>
           </w14:checkbox>
         </w:sdtPr>
+        <w:sdtEndPr/>
         <w:sdtContent>
           <w:r>
             <w:rPr>
@@ -2021,6 +2243,13 @@
         <w:tab/>
         <w:t>________________________________________</w:t>
       </w:r>
+      <w:proofErr w:type="spellStart"/>
+      <w:r>
+        <w:rPr>
+          <w:rFonts w:ascii="Times New Roman" w:eastAsia="Roboto" w:hAnsi="Times New Roman" w:cs="Times New Roman"/>
+        </w:rPr>
+      </w:r>
+      <w:proofErr w:type="spellEnd"/>
     </w:p>
     <w:p>
       <w:pPr>
@@ -2517,6 +2746,7 @@
         <w:tc>
           <w:tcPr>
             <w:tcW w:w="525" w:type="dxa"/>
+            <w:shd w:val="clear" w:color="auto" w:fill="auto"/>
             <w:tcMar>
               <w:top w:w="100" w:type="dxa"/>
               <w:left w:w="100" w:type="dxa"/>
@@ -2544,6 +2774,7 @@
         <w:tc>
           <w:tcPr>
             <w:tcW w:w="640" w:type="dxa"/>
+            <w:shd w:val="clear" w:color="auto" w:fill="auto"/>
             <w:tcMar>
               <w:top w:w="100" w:type="dxa"/>
               <w:left w:w="100" w:type="dxa"/>
@@ -3346,6 +3577,7 @@
         <w:tc>
           <w:tcPr>
             <w:tcW w:w="525" w:type="dxa"/>
+            <w:shd w:val="clear" w:color="auto" w:fill="auto"/>
             <w:tcMar>
               <w:top w:w="100" w:type="dxa"/>
               <w:left w:w="100" w:type="dxa"/>
@@ -3373,6 +3605,7 @@
         <w:tc>
           <w:tcPr>
             <w:tcW w:w="640" w:type="dxa"/>
+            <w:shd w:val="clear" w:color="auto" w:fill="auto"/>
             <w:tcMar>
               <w:top w:w="100" w:type="dxa"/>
               <w:left w:w="100" w:type="dxa"/>
@@ -3548,6 +3781,7 @@
         <w:tc>
           <w:tcPr>
             <w:tcW w:w="525" w:type="dxa"/>
+            <w:shd w:val="clear" w:color="auto" w:fill="auto"/>
             <w:tcMar>
               <w:top w:w="100" w:type="dxa"/>
               <w:left w:w="100" w:type="dxa"/>
@@ -3575,6 +3809,7 @@
         <w:tc>
           <w:tcPr>
             <w:tcW w:w="640" w:type="dxa"/>
+            <w:shd w:val="clear" w:color="auto" w:fill="auto"/>
             <w:tcMar>
               <w:top w:w="100" w:type="dxa"/>
               <w:left w:w="100" w:type="dxa"/>
@@ -3682,9 +3917,8 @@
           <w:i/>
           <w:color w:val="FF0000"/>
         </w:rPr>
-        <w:t xml:space="preserve">forma de </w:t>
-      </w:r>
-      <w:proofErr w:type="gramStart"/>
+        <w:t>forma de ratific</w:t>
+      </w:r>
       <w:r>
         <w:rPr>
           <w:rFonts w:ascii="Times New Roman" w:eastAsia="Roboto" w:hAnsi="Times New Roman" w:cs="Times New Roman"/>
@@ -3692,7 +3926,7 @@
           <w:i/>
           <w:color w:val="FF0000"/>
         </w:rPr>
-        <w:t>ratific</w:t>
+        <w:t>ación</w:t>
       </w:r>
       <w:r>
         <w:rPr>
@@ -3701,18 +3935,8 @@
           <w:i/>
           <w:color w:val="FF0000"/>
         </w:rPr>
-        <w:t>ación</w:t>
-      </w:r>
-      <w:r>
-        <w:rPr>
-          <w:rFonts w:ascii="Times New Roman" w:eastAsia="Roboto" w:hAnsi="Times New Roman" w:cs="Times New Roman"/>
-          <w:b/>
-          <w:i/>
-          <w:color w:val="FF0000"/>
-        </w:rPr>
         <w:t>,?</w:t>
       </w:r>
-      <w:proofErr w:type="gramEnd"/>
       <w:r>
         <w:rPr>
           <w:rFonts w:ascii="Times New Roman" w:eastAsia="Roboto" w:hAnsi="Times New Roman" w:cs="Times New Roman"/>
@@ -4109,9 +4333,111 @@
         <w:t xml:space="preserve"> de Pantalla</w:t>
       </w:r>
     </w:p>
+    <w:p>
+      <w:pPr>
+        <w:pStyle w:val="Normal1"/>
+        <w:spacing w:line="360" w:lineRule="auto"/>
+        <w:rPr>
+          <w:rFonts w:ascii="Times New Roman" w:eastAsia="Roboto" w:hAnsi="Times New Roman" w:cs="Times New Roman"/>
+          <w:b/>
+          <w:sz w:val="28"/>
+          <w:u w:val="single"/>
+          <w:lang w:val="es-ES_tradnl"/>
+        </w:rPr>
+      </w:pPr>
+    </w:p>
+    <w:p>
+      <w:pPr>
+        <w:pStyle w:val="Normal1"/>
+        <w:spacing w:line="360" w:lineRule="auto"/>
+        <w:rPr>
+          <w:rFonts w:ascii="Times New Roman" w:eastAsia="Roboto" w:hAnsi="Times New Roman" w:cs="Times New Roman"/>
+          <w:b/>
+          <w:sz w:val="28"/>
+          <w:u w:val="single"/>
+          <w:lang w:val="es-ES_tradnl"/>
+        </w:rPr>
+      </w:pPr>
+      <w:r>
+        <w:rPr>
+          <w:rFonts w:ascii="Times New Roman" w:eastAsia="Roboto" w:hAnsi="Times New Roman" w:cs="Times New Roman"/>
+          <w:b/>
+          <w:noProof/>
+          <w:sz w:val="28"/>
+          <w:u w:val="single"/>
+        </w:rPr>
+        <w:drawing>
+          <wp:inline distT="0" distB="0" distL="0" distR="0" wp14:anchorId="65AF722C" wp14:editId="1B03BB97">
+            <wp:extent cx="6122035" cy="3276600"/>
+            <wp:effectExtent l="0" t="0" r="0" b="0"/>
+            <wp:docPr id="1" name="Imagen 1"/>
+            <wp:cNvGraphicFramePr>
+              <a:graphicFrameLocks xmlns:a="http://schemas.openxmlformats.org/drawingml/2006/main" noChangeAspect="1"/>
+            </wp:cNvGraphicFramePr>
+            <a:graphic xmlns:a="http://schemas.openxmlformats.org/drawingml/2006/main">
+              <a:graphicData uri="http://schemas.openxmlformats.org/drawingml/2006/picture">
+                <pic:pic xmlns:pic="http://schemas.openxmlformats.org/drawingml/2006/picture">
+                  <pic:nvPicPr>
+                    <pic:cNvPr id="1" name="WhatsApp Image 2025-06-09 at 15.22.11.jpeg"/>
+                    <pic:cNvPicPr/>
+                  </pic:nvPicPr>
+                  <pic:blipFill>
+                    <a:blip r:embed="rId7">
+                      <a:extLst>
+                        <a:ext uri="{28A0092B-C50C-407E-A947-70E740481C1C}">
+                          <a14:useLocalDpi xmlns:a14="http://schemas.microsoft.com/office/drawing/2010/main" val="0"/>
+                        </a:ext>
+                      </a:extLst>
+                    </a:blip>
+                    <a:stretch>
+                      <a:fillRect/>
+                    </a:stretch>
+                  </pic:blipFill>
+                  <pic:spPr>
+                    <a:xfrm>
+                      <a:off x="0" y="0"/>
+                      <a:ext cx="6122035" cy="3276600"/>
+                    </a:xfrm>
+                    <a:prstGeom prst="rect">
+                      <a:avLst/>
+                    </a:prstGeom>
+                  </pic:spPr>
+                </pic:pic>
+              </a:graphicData>
+            </a:graphic>
+          </wp:inline>
+        </w:drawing>
+      </w:r>
+      <w:bookmarkStart w:id="1" w:name="_GoBack"/>
+      <w:bookmarkEnd w:id="1"/>
+    </w:p>
+    <w:p>
+      <w:pPr>
+        <w:pStyle w:val="Normal1"/>
+        <w:spacing w:line="360" w:lineRule="auto"/>
+        <w:rPr>
+          <w:rFonts w:ascii="Times New Roman" w:eastAsia="Roboto" w:hAnsi="Times New Roman" w:cs="Times New Roman"/>
+          <w:b/>
+          <w:i/>
+          <w:lang w:val="es-ES_tradnl"/>
+        </w:rPr>
+      </w:pPr>
+    </w:p>
+    <w:p>
+      <w:pPr>
+        <w:pStyle w:val="Normal1"/>
+        <w:spacing w:line="360" w:lineRule="auto"/>
+        <w:rPr>
+          <w:rFonts w:ascii="Times New Roman" w:eastAsia="Roboto" w:hAnsi="Times New Roman" w:cs="Times New Roman"/>
+          <w:b/>
+          <w:i/>
+          <w:lang w:val="es-ES_tradnl"/>
+        </w:rPr>
+      </w:pPr>
+    </w:p>
     <w:sectPr>
-      <w:headerReference w:type="default" r:id="rId7"/>
-      <w:footerReference w:type="default" r:id="rId8"/>
+      <w:headerReference w:type="default" r:id="rId8"/>
+      <w:footerReference w:type="default" r:id="rId9"/>
       <w:pgSz w:w="11909" w:h="16834"/>
       <w:pgMar w:top="1702" w:right="1134" w:bottom="568" w:left="1134" w:header="0" w:footer="720" w:gutter="0"/>
       <w:pgNumType w:start="1"/>
@@ -4122,7 +4448,7 @@
 </file>
 
 <file path=word/endnotes.xml><?xml version="1.0" encoding="utf-8"?>
-<w:endnotes xmlns:wpc="http://schemas.microsoft.com/office/word/2010/wordprocessingCanvas" xmlns:cx="http://schemas.microsoft.com/office/drawing/2014/chartex" xmlns:cx1="http://schemas.microsoft.com/office/drawing/2015/9/8/chartex" xmlns:cx2="http://schemas.microsoft.com/office/drawing/2015/10/21/chartex" xmlns:cx3="http://schemas.microsoft.com/office/drawing/2016/5/9/chartex" xmlns:cx4="http://schemas.microsoft.com/office/drawing/2016/5/10/chartex" xmlns:cx5="http://schemas.microsoft.com/office/drawing/2016/5/11/chartex" xmlns:cx6="http://schemas.microsoft.com/office/drawing/2016/5/12/chartex" xmlns:cx7="http://schemas.microsoft.com/office/drawing/2016/5/13/chartex" xmlns:cx8="http://schemas.microsoft.com/office/drawing/2016/5/14/chartex" xmlns:mc="http://schemas.openxmlformats.org/markup-compatibility/2006" xmlns:aink="http://schemas.microsoft.com/office/drawing/2016/ink" xmlns:am3d="http://schemas.microsoft.com/office/drawing/2017/model3d" xmlns:o="urn:schemas-microsoft-com:office:office" xmlns:oel="http://schemas.microsoft.com/office/2019/extlst" xmlns:r="http://schemas.openxmlformats.org/officeDocument/2006/relationships" xmlns:m="http://schemas.openxmlformats.org/officeDocument/2006/math" xmlns:v="urn:schemas-microsoft-com:vml" xmlns:wp14="http://schemas.microsoft.com/office/word/2010/wordprocessingDrawing" xmlns:wp="http://schemas.openxmlformats.org/drawingml/2006/wordprocessingDrawing" xmlns:w10="urn:schemas-microsoft-com:office:word" xmlns:w="http://schemas.openxmlformats.org/wordprocessingml/2006/main" xmlns:w14="http://schemas.microsoft.com/office/word/2010/wordml" xmlns:w15="http://schemas.microsoft.com/office/word/2012/wordml" xmlns:w16cei="http://schemas.microsoft.com/office/word/2026/wordml/cei" xmlns:w16cex="http://schemas.microsoft.com/office/word/2018/wordml/cex" xmlns:w16cid="http://schemas.microsoft.com/office/word/2016/wordml/cid" xmlns:w16="http://schemas.microsoft.com/office/word/2018/wordml" xmlns:w16du="http://schemas.microsoft.com/office/word/2023/wordml/word16du" xmlns:w16sdtdh="http://schemas.microsoft.com/office/word/2020/wordml/sdtdatahash" xmlns:w16sdtfl="http://schemas.microsoft.com/office/word/2024/wordml/sdtformatlock" xmlns:w16se="http://schemas.microsoft.com/office/word/2015/wordml/symex" xmlns:wpg="http://schemas.microsoft.com/office/word/2010/wordprocessingGroup" xmlns:wpi="http://schemas.microsoft.com/office/word/2010/wordprocessingInk" xmlns:wne="http://schemas.microsoft.com/office/word/2006/wordml" xmlns:wps="http://schemas.microsoft.com/office/word/2010/wordprocessingShape" mc:Ignorable="w14 w15 w16se w16cid w16 w16cex w16sdtdh w16sdtfl w16du wp14">
+<w:endnotes xmlns:wpc="http://schemas.microsoft.com/office/word/2010/wordprocessingCanvas" xmlns:cx="http://schemas.microsoft.com/office/drawing/2014/chartex" xmlns:cx1="http://schemas.microsoft.com/office/drawing/2015/9/8/chartex" xmlns:mc="http://schemas.openxmlformats.org/markup-compatibility/2006" xmlns:o="urn:schemas-microsoft-com:office:office" xmlns:r="http://schemas.openxmlformats.org/officeDocument/2006/relationships" xmlns:m="http://schemas.openxmlformats.org/officeDocument/2006/math" xmlns:v="urn:schemas-microsoft-com:vml" xmlns:wp14="http://schemas.microsoft.com/office/word/2010/wordprocessingDrawing" xmlns:wp="http://schemas.openxmlformats.org/drawingml/2006/wordprocessingDrawing" xmlns:w10="urn:schemas-microsoft-com:office:word" xmlns:w="http://schemas.openxmlformats.org/wordprocessingml/2006/main" xmlns:w14="http://schemas.microsoft.com/office/word/2010/wordml" xmlns:w15="http://schemas.microsoft.com/office/word/2012/wordml" xmlns:w16se="http://schemas.microsoft.com/office/word/2015/wordml/symex" xmlns:wpg="http://schemas.microsoft.com/office/word/2010/wordprocessingGroup" xmlns:wpi="http://schemas.microsoft.com/office/word/2010/wordprocessingInk" xmlns:wne="http://schemas.microsoft.com/office/word/2006/wordml" xmlns:wps="http://schemas.microsoft.com/office/word/2010/wordprocessingShape" mc:Ignorable="w14 w15 w16se wp14">
   <w:endnote w:type="separator" w:id="-1">
     <w:p>
       <w:pPr>
@@ -4147,7 +4473,7 @@
 </file>
 
 <file path=word/footer1.xml><?xml version="1.0" encoding="utf-8"?>
-<w:ftr xmlns:wpc="http://schemas.microsoft.com/office/word/2010/wordprocessingCanvas" xmlns:cx="http://schemas.microsoft.com/office/drawing/2014/chartex" xmlns:cx1="http://schemas.microsoft.com/office/drawing/2015/9/8/chartex" xmlns:cx2="http://schemas.microsoft.com/office/drawing/2015/10/21/chartex" xmlns:cx3="http://schemas.microsoft.com/office/drawing/2016/5/9/chartex" xmlns:cx4="http://schemas.microsoft.com/office/drawing/2016/5/10/chartex" xmlns:cx5="http://schemas.microsoft.com/office/drawing/2016/5/11/chartex" xmlns:cx6="http://schemas.microsoft.com/office/drawing/2016/5/12/chartex" xmlns:cx7="http://schemas.microsoft.com/office/drawing/2016/5/13/chartex" xmlns:cx8="http://schemas.microsoft.com/office/drawing/2016/5/14/chartex" xmlns:mc="http://schemas.openxmlformats.org/markup-compatibility/2006" xmlns:aink="http://schemas.microsoft.com/office/drawing/2016/ink" xmlns:am3d="http://schemas.microsoft.com/office/drawing/2017/model3d" xmlns:o="urn:schemas-microsoft-com:office:office" xmlns:oel="http://schemas.microsoft.com/office/2019/extlst" xmlns:r="http://schemas.openxmlformats.org/officeDocument/2006/relationships" xmlns:m="http://schemas.openxmlformats.org/officeDocument/2006/math" xmlns:v="urn:schemas-microsoft-com:vml" xmlns:wp14="http://schemas.microsoft.com/office/word/2010/wordprocessingDrawing" xmlns:wp="http://schemas.openxmlformats.org/drawingml/2006/wordprocessingDrawing" xmlns:w10="urn:schemas-microsoft-com:office:word" xmlns:w="http://schemas.openxmlformats.org/wordprocessingml/2006/main" xmlns:w14="http://schemas.microsoft.com/office/word/2010/wordml" xmlns:w15="http://schemas.microsoft.com/office/word/2012/wordml" xmlns:w16cei="http://schemas.microsoft.com/office/word/2026/wordml/cei" xmlns:w16cex="http://schemas.microsoft.com/office/word/2018/wordml/cex" xmlns:w16cid="http://schemas.microsoft.com/office/word/2016/wordml/cid" xmlns:w16="http://schemas.microsoft.com/office/word/2018/wordml" xmlns:w16du="http://schemas.microsoft.com/office/word/2023/wordml/word16du" xmlns:w16sdtdh="http://schemas.microsoft.com/office/word/2020/wordml/sdtdatahash" xmlns:w16sdtfl="http://schemas.microsoft.com/office/word/2024/wordml/sdtformatlock" xmlns:w16se="http://schemas.microsoft.com/office/word/2015/wordml/symex" xmlns:wpg="http://schemas.microsoft.com/office/word/2010/wordprocessingGroup" xmlns:wpi="http://schemas.microsoft.com/office/word/2010/wordprocessingInk" xmlns:wne="http://schemas.microsoft.com/office/word/2006/wordml" xmlns:wps="http://schemas.microsoft.com/office/word/2010/wordprocessingShape" mc:Ignorable="w14 w15 w16se w16cid w16 w16cex w16sdtdh w16sdtfl w16du wp14">
+<w:ftr xmlns:wpc="http://schemas.microsoft.com/office/word/2010/wordprocessingCanvas" xmlns:cx="http://schemas.microsoft.com/office/drawing/2014/chartex" xmlns:cx1="http://schemas.microsoft.com/office/drawing/2015/9/8/chartex" xmlns:mc="http://schemas.openxmlformats.org/markup-compatibility/2006" xmlns:o="urn:schemas-microsoft-com:office:office" xmlns:r="http://schemas.openxmlformats.org/officeDocument/2006/relationships" xmlns:m="http://schemas.openxmlformats.org/officeDocument/2006/math" xmlns:v="urn:schemas-microsoft-com:vml" xmlns:wp14="http://schemas.microsoft.com/office/word/2010/wordprocessingDrawing" xmlns:wp="http://schemas.openxmlformats.org/drawingml/2006/wordprocessingDrawing" xmlns:w10="urn:schemas-microsoft-com:office:word" xmlns:w="http://schemas.openxmlformats.org/wordprocessingml/2006/main" xmlns:w14="http://schemas.microsoft.com/office/word/2010/wordml" xmlns:w15="http://schemas.microsoft.com/office/word/2012/wordml" xmlns:w16se="http://schemas.microsoft.com/office/word/2015/wordml/symex" xmlns:wpg="http://schemas.microsoft.com/office/word/2010/wordprocessingGroup" xmlns:wpi="http://schemas.microsoft.com/office/word/2010/wordprocessingInk" xmlns:wne="http://schemas.microsoft.com/office/word/2006/wordml" xmlns:wps="http://schemas.microsoft.com/office/word/2010/wordprocessingShape" mc:Ignorable="w14 w15 w16se wp14">
   <w:p>
     <w:pPr>
       <w:pStyle w:val="Normal1"/>
@@ -4168,7 +4494,7 @@
 </file>
 
 <file path=word/footnotes.xml><?xml version="1.0" encoding="utf-8"?>
-<w:footnotes xmlns:wpc="http://schemas.microsoft.com/office/word/2010/wordprocessingCanvas" xmlns:cx="http://schemas.microsoft.com/office/drawing/2014/chartex" xmlns:cx1="http://schemas.microsoft.com/office/drawing/2015/9/8/chartex" xmlns:cx2="http://schemas.microsoft.com/office/drawing/2015/10/21/chartex" xmlns:cx3="http://schemas.microsoft.com/office/drawing/2016/5/9/chartex" xmlns:cx4="http://schemas.microsoft.com/office/drawing/2016/5/10/chartex" xmlns:cx5="http://schemas.microsoft.com/office/drawing/2016/5/11/chartex" xmlns:cx6="http://schemas.microsoft.com/office/drawing/2016/5/12/chartex" xmlns:cx7="http://schemas.microsoft.com/office/drawing/2016/5/13/chartex" xmlns:cx8="http://schemas.microsoft.com/office/drawing/2016/5/14/chartex" xmlns:mc="http://schemas.openxmlformats.org/markup-compatibility/2006" xmlns:aink="http://schemas.microsoft.com/office/drawing/2016/ink" xmlns:am3d="http://schemas.microsoft.com/office/drawing/2017/model3d" xmlns:o="urn:schemas-microsoft-com:office:office" xmlns:oel="http://schemas.microsoft.com/office/2019/extlst" xmlns:r="http://schemas.openxmlformats.org/officeDocument/2006/relationships" xmlns:m="http://schemas.openxmlformats.org/officeDocument/2006/math" xmlns:v="urn:schemas-microsoft-com:vml" xmlns:wp14="http://schemas.microsoft.com/office/word/2010/wordprocessingDrawing" xmlns:wp="http://schemas.openxmlformats.org/drawingml/2006/wordprocessingDrawing" xmlns:w10="urn:schemas-microsoft-com:office:word" xmlns:w="http://schemas.openxmlformats.org/wordprocessingml/2006/main" xmlns:w14="http://schemas.microsoft.com/office/word/2010/wordml" xmlns:w15="http://schemas.microsoft.com/office/word/2012/wordml" xmlns:w16cei="http://schemas.microsoft.com/office/word/2026/wordml/cei" xmlns:w16cex="http://schemas.microsoft.com/office/word/2018/wordml/cex" xmlns:w16cid="http://schemas.microsoft.com/office/word/2016/wordml/cid" xmlns:w16="http://schemas.microsoft.com/office/word/2018/wordml" xmlns:w16du="http://schemas.microsoft.com/office/word/2023/wordml/word16du" xmlns:w16sdtdh="http://schemas.microsoft.com/office/word/2020/wordml/sdtdatahash" xmlns:w16sdtfl="http://schemas.microsoft.com/office/word/2024/wordml/sdtformatlock" xmlns:w16se="http://schemas.microsoft.com/office/word/2015/wordml/symex" xmlns:wpg="http://schemas.microsoft.com/office/word/2010/wordprocessingGroup" xmlns:wpi="http://schemas.microsoft.com/office/word/2010/wordprocessingInk" xmlns:wne="http://schemas.microsoft.com/office/word/2006/wordml" xmlns:wps="http://schemas.microsoft.com/office/word/2010/wordprocessingShape" mc:Ignorable="w14 w15 w16se w16cid w16 w16cex w16sdtdh w16sdtfl w16du wp14">
+<w:footnotes xmlns:wpc="http://schemas.microsoft.com/office/word/2010/wordprocessingCanvas" xmlns:cx="http://schemas.microsoft.com/office/drawing/2014/chartex" xmlns:cx1="http://schemas.microsoft.com/office/drawing/2015/9/8/chartex" xmlns:mc="http://schemas.openxmlformats.org/markup-compatibility/2006" xmlns:o="urn:schemas-microsoft-com:office:office" xmlns:r="http://schemas.openxmlformats.org/officeDocument/2006/relationships" xmlns:m="http://schemas.openxmlformats.org/officeDocument/2006/math" xmlns:v="urn:schemas-microsoft-com:vml" xmlns:wp14="http://schemas.microsoft.com/office/word/2010/wordprocessingDrawing" xmlns:wp="http://schemas.openxmlformats.org/drawingml/2006/wordprocessingDrawing" xmlns:w10="urn:schemas-microsoft-com:office:word" xmlns:w="http://schemas.openxmlformats.org/wordprocessingml/2006/main" xmlns:w14="http://schemas.microsoft.com/office/word/2010/wordml" xmlns:w15="http://schemas.microsoft.com/office/word/2012/wordml" xmlns:w16se="http://schemas.microsoft.com/office/word/2015/wordml/symex" xmlns:wpg="http://schemas.microsoft.com/office/word/2010/wordprocessingGroup" xmlns:wpi="http://schemas.microsoft.com/office/word/2010/wordprocessingInk" xmlns:wne="http://schemas.microsoft.com/office/word/2006/wordml" xmlns:wps="http://schemas.microsoft.com/office/word/2010/wordprocessingShape" mc:Ignorable="w14 w15 w16se wp14">
   <w:footnote w:type="separator" w:id="-1">
     <w:p>
       <w:pPr>
@@ -4193,7 +4519,7 @@
 </file>
 
 <file path=word/header1.xml><?xml version="1.0" encoding="utf-8"?>
-<w:hdr xmlns:wpc="http://schemas.microsoft.com/office/word/2010/wordprocessingCanvas" xmlns:cx="http://schemas.microsoft.com/office/drawing/2014/chartex" xmlns:cx1="http://schemas.microsoft.com/office/drawing/2015/9/8/chartex" xmlns:cx2="http://schemas.microsoft.com/office/drawing/2015/10/21/chartex" xmlns:cx3="http://schemas.microsoft.com/office/drawing/2016/5/9/chartex" xmlns:cx4="http://schemas.microsoft.com/office/drawing/2016/5/10/chartex" xmlns:cx5="http://schemas.microsoft.com/office/drawing/2016/5/11/chartex" xmlns:cx6="http://schemas.microsoft.com/office/drawing/2016/5/12/chartex" xmlns:cx7="http://schemas.microsoft.com/office/drawing/2016/5/13/chartex" xmlns:cx8="http://schemas.microsoft.com/office/drawing/2016/5/14/chartex" xmlns:mc="http://schemas.openxmlformats.org/markup-compatibility/2006" xmlns:aink="http://schemas.microsoft.com/office/drawing/2016/ink" xmlns:am3d="http://schemas.microsoft.com/office/drawing/2017/model3d" xmlns:o="urn:schemas-microsoft-com:office:office" xmlns:oel="http://schemas.microsoft.com/office/2019/extlst" xmlns:r="http://schemas.openxmlformats.org/officeDocument/2006/relationships" xmlns:m="http://schemas.openxmlformats.org/officeDocument/2006/math" xmlns:v="urn:schemas-microsoft-com:vml" xmlns:wp14="http://schemas.microsoft.com/office/word/2010/wordprocessingDrawing" xmlns:wp="http://schemas.openxmlformats.org/drawingml/2006/wordprocessingDrawing" xmlns:w10="urn:schemas-microsoft-com:office:word" xmlns:w="http://schemas.openxmlformats.org/wordprocessingml/2006/main" xmlns:w14="http://schemas.microsoft.com/office/word/2010/wordml" xmlns:w15="http://schemas.microsoft.com/office/word/2012/wordml" xmlns:w16cei="http://schemas.microsoft.com/office/word/2026/wordml/cei" xmlns:w16cex="http://schemas.microsoft.com/office/word/2018/wordml/cex" xmlns:w16cid="http://schemas.microsoft.com/office/word/2016/wordml/cid" xmlns:w16="http://schemas.microsoft.com/office/word/2018/wordml" xmlns:w16du="http://schemas.microsoft.com/office/word/2023/wordml/word16du" xmlns:w16sdtdh="http://schemas.microsoft.com/office/word/2020/wordml/sdtdatahash" xmlns:w16sdtfl="http://schemas.microsoft.com/office/word/2024/wordml/sdtformatlock" xmlns:w16se="http://schemas.microsoft.com/office/word/2015/wordml/symex" xmlns:wpg="http://schemas.microsoft.com/office/word/2010/wordprocessingGroup" xmlns:wpi="http://schemas.microsoft.com/office/word/2010/wordprocessingInk" xmlns:wne="http://schemas.microsoft.com/office/word/2006/wordml" xmlns:wps="http://schemas.microsoft.com/office/word/2010/wordprocessingShape" mc:Ignorable="w14 w15 w16se w16cid w16 w16cex w16sdtdh w16sdtfl w16du wp14">
+<w:hdr xmlns:wpc="http://schemas.microsoft.com/office/word/2010/wordprocessingCanvas" xmlns:cx="http://schemas.microsoft.com/office/drawing/2014/chartex" xmlns:cx1="http://schemas.microsoft.com/office/drawing/2015/9/8/chartex" xmlns:mc="http://schemas.openxmlformats.org/markup-compatibility/2006" xmlns:o="urn:schemas-microsoft-com:office:office" xmlns:r="http://schemas.openxmlformats.org/officeDocument/2006/relationships" xmlns:m="http://schemas.openxmlformats.org/officeDocument/2006/math" xmlns:v="urn:schemas-microsoft-com:vml" xmlns:wp14="http://schemas.microsoft.com/office/word/2010/wordprocessingDrawing" xmlns:wp="http://schemas.openxmlformats.org/drawingml/2006/wordprocessingDrawing" xmlns:w10="urn:schemas-microsoft-com:office:word" xmlns:w="http://schemas.openxmlformats.org/wordprocessingml/2006/main" xmlns:w14="http://schemas.microsoft.com/office/word/2010/wordml" xmlns:w15="http://schemas.microsoft.com/office/word/2012/wordml" xmlns:w16se="http://schemas.microsoft.com/office/word/2015/wordml/symex" xmlns:wpg="http://schemas.microsoft.com/office/word/2010/wordprocessingGroup" xmlns:wpi="http://schemas.microsoft.com/office/word/2010/wordprocessingInk" xmlns:wne="http://schemas.microsoft.com/office/word/2006/wordml" xmlns:wps="http://schemas.microsoft.com/office/word/2010/wordprocessingShape" mc:Ignorable="w14 w15 w16se wp14">
   <w:p>
     <w:pPr>
       <w:pStyle w:val="Normal1"/>
@@ -4287,7 +4613,7 @@
 </file>
 
 <file path=word/numbering.xml><?xml version="1.0" encoding="utf-8"?>
-<w:numbering xmlns:wpc="http://schemas.microsoft.com/office/word/2010/wordprocessingCanvas" xmlns:cx="http://schemas.microsoft.com/office/drawing/2014/chartex" xmlns:cx1="http://schemas.microsoft.com/office/drawing/2015/9/8/chartex" xmlns:cx2="http://schemas.microsoft.com/office/drawing/2015/10/21/chartex" xmlns:cx3="http://schemas.microsoft.com/office/drawing/2016/5/9/chartex" xmlns:cx4="http://schemas.microsoft.com/office/drawing/2016/5/10/chartex" xmlns:cx5="http://schemas.microsoft.com/office/drawing/2016/5/11/chartex" xmlns:cx6="http://schemas.microsoft.com/office/drawing/2016/5/12/chartex" xmlns:cx7="http://schemas.microsoft.com/office/drawing/2016/5/13/chartex" xmlns:cx8="http://schemas.microsoft.com/office/drawing/2016/5/14/chartex" xmlns:mc="http://schemas.openxmlformats.org/markup-compatibility/2006" xmlns:aink="http://schemas.microsoft.com/office/drawing/2016/ink" xmlns:am3d="http://schemas.microsoft.com/office/drawing/2017/model3d" xmlns:o="urn:schemas-microsoft-com:office:office" xmlns:oel="http://schemas.microsoft.com/office/2019/extlst" xmlns:r="http://schemas.openxmlformats.org/officeDocument/2006/relationships" xmlns:m="http://schemas.openxmlformats.org/officeDocument/2006/math" xmlns:v="urn:schemas-microsoft-com:vml" xmlns:wp14="http://schemas.microsoft.com/office/word/2010/wordprocessingDrawing" xmlns:wp="http://schemas.openxmlformats.org/drawingml/2006/wordprocessingDrawing" xmlns:w10="urn:schemas-microsoft-com:office:word" xmlns:w="http://schemas.openxmlformats.org/wordprocessingml/2006/main" xmlns:w14="http://schemas.microsoft.com/office/word/2010/wordml" xmlns:w15="http://schemas.microsoft.com/office/word/2012/wordml" xmlns:w16cei="http://schemas.microsoft.com/office/word/2026/wordml/cei" xmlns:w16cex="http://schemas.microsoft.com/office/word/2018/wordml/cex" xmlns:w16cid="http://schemas.microsoft.com/office/word/2016/wordml/cid" xmlns:w16="http://schemas.microsoft.com/office/word/2018/wordml" xmlns:w16du="http://schemas.microsoft.com/office/word/2023/wordml/word16du" xmlns:w16sdtdh="http://schemas.microsoft.com/office/word/2020/wordml/sdtdatahash" xmlns:w16sdtfl="http://schemas.microsoft.com/office/word/2024/wordml/sdtformatlock" xmlns:w16se="http://schemas.microsoft.com/office/word/2015/wordml/symex" xmlns:wpg="http://schemas.microsoft.com/office/word/2010/wordprocessingGroup" xmlns:wpi="http://schemas.microsoft.com/office/word/2010/wordprocessingInk" xmlns:wne="http://schemas.microsoft.com/office/word/2006/wordml" xmlns:wps="http://schemas.microsoft.com/office/word/2010/wordprocessingShape" mc:Ignorable="w14 w15 w16se w16cid w16 w16cex w16sdtdh w16sdtfl w16du wp14">
+<w:numbering xmlns:wpc="http://schemas.microsoft.com/office/word/2010/wordprocessingCanvas" xmlns:cx="http://schemas.microsoft.com/office/drawing/2014/chartex" xmlns:cx1="http://schemas.microsoft.com/office/drawing/2015/9/8/chartex" xmlns:mc="http://schemas.openxmlformats.org/markup-compatibility/2006" xmlns:o="urn:schemas-microsoft-com:office:office" xmlns:r="http://schemas.openxmlformats.org/officeDocument/2006/relationships" xmlns:m="http://schemas.openxmlformats.org/officeDocument/2006/math" xmlns:v="urn:schemas-microsoft-com:vml" xmlns:wp14="http://schemas.microsoft.com/office/word/2010/wordprocessingDrawing" xmlns:wp="http://schemas.openxmlformats.org/drawingml/2006/wordprocessingDrawing" xmlns:w10="urn:schemas-microsoft-com:office:word" xmlns:w="http://schemas.openxmlformats.org/wordprocessingml/2006/main" xmlns:w14="http://schemas.microsoft.com/office/word/2010/wordml" xmlns:w15="http://schemas.microsoft.com/office/word/2012/wordml" xmlns:w16se="http://schemas.microsoft.com/office/word/2015/wordml/symex" xmlns:wpg="http://schemas.microsoft.com/office/word/2010/wordprocessingGroup" xmlns:wpi="http://schemas.microsoft.com/office/word/2010/wordprocessingInk" xmlns:wne="http://schemas.microsoft.com/office/word/2006/wordml" xmlns:wps="http://schemas.microsoft.com/office/word/2010/wordprocessingShape" mc:Ignorable="w14 w15 w16se wp14">
   <w:abstractNum w:abstractNumId="0" w15:restartNumberingAfterBreak="0">
     <w:nsid w:val="019733CC"/>
     <w:multiLevelType w:val="multilevel"/>
@@ -6004,56 +6330,56 @@
       </w:rPr>
     </w:lvl>
   </w:abstractNum>
-  <w:num w:numId="1" w16cid:durableId="67770794">
+  <w:num w:numId="1">
     <w:abstractNumId w:val="0"/>
   </w:num>
-  <w:num w:numId="2" w16cid:durableId="1338191347">
+  <w:num w:numId="2">
     <w:abstractNumId w:val="1"/>
   </w:num>
-  <w:num w:numId="3" w16cid:durableId="2129737444">
+  <w:num w:numId="3">
     <w:abstractNumId w:val="5"/>
   </w:num>
-  <w:num w:numId="4" w16cid:durableId="1328557383">
+  <w:num w:numId="4">
     <w:abstractNumId w:val="9"/>
   </w:num>
-  <w:num w:numId="5" w16cid:durableId="412896258">
+  <w:num w:numId="5">
     <w:abstractNumId w:val="3"/>
   </w:num>
-  <w:num w:numId="6" w16cid:durableId="1616909209">
+  <w:num w:numId="6">
     <w:abstractNumId w:val="11"/>
   </w:num>
-  <w:num w:numId="7" w16cid:durableId="930166343">
+  <w:num w:numId="7">
     <w:abstractNumId w:val="14"/>
   </w:num>
-  <w:num w:numId="8" w16cid:durableId="1036927692">
+  <w:num w:numId="8">
     <w:abstractNumId w:val="7"/>
   </w:num>
-  <w:num w:numId="9" w16cid:durableId="984235748">
+  <w:num w:numId="9">
     <w:abstractNumId w:val="10"/>
   </w:num>
-  <w:num w:numId="10" w16cid:durableId="1166090295">
+  <w:num w:numId="10">
     <w:abstractNumId w:val="2"/>
   </w:num>
-  <w:num w:numId="11" w16cid:durableId="2069840414">
+  <w:num w:numId="11">
     <w:abstractNumId w:val="6"/>
   </w:num>
-  <w:num w:numId="12" w16cid:durableId="1997806137">
+  <w:num w:numId="12">
     <w:abstractNumId w:val="12"/>
   </w:num>
-  <w:num w:numId="13" w16cid:durableId="1725717503">
+  <w:num w:numId="13">
     <w:abstractNumId w:val="4"/>
   </w:num>
-  <w:num w:numId="14" w16cid:durableId="858278612">
+  <w:num w:numId="14">
     <w:abstractNumId w:val="13"/>
   </w:num>
-  <w:num w:numId="15" w16cid:durableId="971136506">
+  <w:num w:numId="15">
     <w:abstractNumId w:val="8"/>
   </w:num>
 </w:numbering>
 </file>
 
 <file path=word/styles.xml><?xml version="1.0" encoding="utf-8"?>
-<w:styles xmlns:mc="http://schemas.openxmlformats.org/markup-compatibility/2006" xmlns:r="http://schemas.openxmlformats.org/officeDocument/2006/relationships" xmlns:w="http://schemas.openxmlformats.org/wordprocessingml/2006/main" xmlns:w14="http://schemas.microsoft.com/office/word/2010/wordml" xmlns:w15="http://schemas.microsoft.com/office/word/2012/wordml" xmlns:w16cex="http://schemas.microsoft.com/office/word/2018/wordml/cex" xmlns:w16cid="http://schemas.microsoft.com/office/word/2016/wordml/cid" xmlns:w16="http://schemas.microsoft.com/office/word/2018/wordml" xmlns:w16du="http://schemas.microsoft.com/office/word/2023/wordml/word16du" xmlns:w16sdtdh="http://schemas.microsoft.com/office/word/2020/wordml/sdtdatahash" xmlns:w16sdtfl="http://schemas.microsoft.com/office/word/2024/wordml/sdtformatlock" xmlns:w16se="http://schemas.microsoft.com/office/word/2015/wordml/symex" mc:Ignorable="w14 w15 w16se w16cid w16 w16cex w16sdtdh w16sdtfl w16du">
+<w:styles xmlns:mc="http://schemas.openxmlformats.org/markup-compatibility/2006" xmlns:r="http://schemas.openxmlformats.org/officeDocument/2006/relationships" xmlns:w="http://schemas.openxmlformats.org/wordprocessingml/2006/main" xmlns:w14="http://schemas.microsoft.com/office/word/2010/wordml" xmlns:w15="http://schemas.microsoft.com/office/word/2012/wordml" xmlns:w16se="http://schemas.microsoft.com/office/word/2015/wordml/symex" mc:Ignorable="w14 w15 w16se">
   <w:docDefaults>
     <w:rPrDefault>
       <w:rPr>
@@ -6070,7 +6396,7 @@
       </w:pPr>
     </w:pPrDefault>
   </w:docDefaults>
-  <w:latentStyles w:defLockedState="0" w:defUIPriority="99" w:defSemiHidden="0" w:defUnhideWhenUsed="0" w:defQFormat="0" w:count="376">
+  <w:latentStyles w:defLockedState="0" w:defUIPriority="99" w:defSemiHidden="0" w:defUnhideWhenUsed="0" w:defQFormat="0" w:count="371">
     <w:lsdException w:name="Normal" w:uiPriority="0" w:qFormat="1"/>
     <w:lsdException w:name="heading 1" w:uiPriority="9" w:qFormat="1"/>
     <w:lsdException w:name="heading 2" w:semiHidden="1" w:uiPriority="9" w:unhideWhenUsed="1" w:qFormat="1"/>
@@ -6442,11 +6768,6 @@
     <w:lsdException w:name="List Table 5 Dark Accent 6" w:uiPriority="50"/>
     <w:lsdException w:name="List Table 6 Colorful Accent 6" w:uiPriority="51"/>
     <w:lsdException w:name="List Table 7 Colorful Accent 6" w:uiPriority="52"/>
-    <w:lsdException w:name="Mention" w:semiHidden="1" w:unhideWhenUsed="1"/>
-    <w:lsdException w:name="Smart Hyperlink" w:semiHidden="1" w:unhideWhenUsed="1"/>
-    <w:lsdException w:name="Hashtag" w:semiHidden="1" w:unhideWhenUsed="1"/>
-    <w:lsdException w:name="Unresolved Mention" w:semiHidden="1" w:unhideWhenUsed="1"/>
-    <w:lsdException w:name="Smart Link" w:semiHidden="1" w:unhideWhenUsed="1"/>
   </w:latentStyles>
   <w:style w:type="paragraph" w:default="1" w:styleId="Normal">
     <w:name w:val="Normal"/>

</xml_diff>